<commit_message>
Implement SEO prerendering and metadata strategy
</commit_message>
<xml_diff>
--- a/public/assets/cv-falopes-2026-ptbr.docx
+++ b/public/assets/cv-falopes-2026-ptbr.docx
@@ -159,7 +159,25 @@
           <w:sz w:val="16"/>
           <w:szCs w:val="16"/>
         </w:rPr>
-        <w:t xml:space="preserve"> +55 (11) 99998-1734 • Diadema – SP, Brasil</w:t>
+        <w:t xml:space="preserve"> +55 (11) 99998-1734 • </w:t>
+      </w:r>
+      <w:r>
+        <w:rPr>
+          <w:rFonts w:ascii="Manrope" w:hAnsi="Manrope"/>
+          <w:color w:val="0E2841" w:themeColor="text2"/>
+          <w:sz w:val="16"/>
+          <w:szCs w:val="16"/>
+        </w:rPr>
+        <w:t>Santo André</w:t>
+      </w:r>
+      <w:r>
+        <w:rPr>
+          <w:rFonts w:ascii="Manrope" w:hAnsi="Manrope"/>
+          <w:color w:val="0E2841" w:themeColor="text2"/>
+          <w:sz w:val="16"/>
+          <w:szCs w:val="16"/>
+        </w:rPr>
+        <w:t xml:space="preserve"> – SP, Brasil</w:t>
       </w:r>
     </w:p>
     <w:p>
@@ -206,41 +224,13 @@
           <w:szCs w:val="16"/>
         </w:rPr>
       </w:pPr>
-      <w:proofErr w:type="spellStart"/>
-      <w:r>
-        <w:rPr>
-          <w:rFonts w:ascii="Manrope" w:hAnsi="Manrope"/>
-          <w:sz w:val="16"/>
-          <w:szCs w:val="16"/>
-        </w:rPr>
-        <w:t>Product</w:t>
-      </w:r>
-      <w:proofErr w:type="spellEnd"/>
-      <w:r>
-        <w:rPr>
-          <w:rFonts w:ascii="Manrope" w:hAnsi="Manrope"/>
-          <w:sz w:val="16"/>
-          <w:szCs w:val="16"/>
-        </w:rPr>
-        <w:t xml:space="preserve"> Designer sênior com mais de 20 anos de trajetória em design e forte atuação na criação de produtos digitais, plataformas responsivas e experiências para negócios B2B. Minha carreira começou no design gráfico e na web, evoluindo para UX/UI e </w:t>
-      </w:r>
-      <w:proofErr w:type="spellStart"/>
-      <w:r>
-        <w:rPr>
-          <w:rFonts w:ascii="Manrope" w:hAnsi="Manrope"/>
-          <w:sz w:val="16"/>
-          <w:szCs w:val="16"/>
-        </w:rPr>
-        <w:t>Product</w:t>
-      </w:r>
-      <w:proofErr w:type="spellEnd"/>
-      <w:r>
-        <w:rPr>
-          <w:rFonts w:ascii="Manrope" w:hAnsi="Manrope"/>
-          <w:sz w:val="16"/>
-          <w:szCs w:val="16"/>
-        </w:rPr>
-        <w:t xml:space="preserve"> Design - uma combinação que me permite conectar clareza visual, necessidades do negócio e viabilidade técnica.</w:t>
+      <w:r>
+        <w:rPr>
+          <w:rFonts w:ascii="Manrope" w:hAnsi="Manrope"/>
+          <w:sz w:val="16"/>
+          <w:szCs w:val="16"/>
+        </w:rPr>
+        <w:t>Product Designer sênior com mais de 20 anos de trajetória em design e forte atuação na criação de produtos digitais, plataformas responsivas e experiências para negócios B2B. Minha carreira começou no design gráfico e na web, evoluindo para UX/UI e Product Design - uma combinação que me permite conectar clareza visual, necessidades do negócio e viabilidade técnica.</w:t>
       </w:r>
     </w:p>
     <w:p>
@@ -258,25 +248,7 @@
           <w:sz w:val="16"/>
           <w:szCs w:val="16"/>
         </w:rPr>
-        <w:t xml:space="preserve">Atuo da compreensão do problema à entrega para desenvolvimento: organizo requisitos, jornadas e fluxos, crio </w:t>
-      </w:r>
-      <w:proofErr w:type="spellStart"/>
-      <w:r>
-        <w:rPr>
-          <w:rFonts w:ascii="Manrope" w:hAnsi="Manrope"/>
-          <w:sz w:val="16"/>
-          <w:szCs w:val="16"/>
-        </w:rPr>
-        <w:t>wireframes</w:t>
-      </w:r>
-      <w:proofErr w:type="spellEnd"/>
-      <w:r>
-        <w:rPr>
-          <w:rFonts w:ascii="Manrope" w:hAnsi="Manrope"/>
-          <w:sz w:val="16"/>
-          <w:szCs w:val="16"/>
-        </w:rPr>
-        <w:t xml:space="preserve"> e protótipos, estruturo interfaces e acompanho a implementação junto a stakeholders e engenharia. Também utilizo IA generativa e ferramentas de código para acelerar exploração, documentação e construção de experiências.</w:t>
+        <w:t>Atuo da compreensão do problema à entrega para desenvolvimento: organizo requisitos, jornadas e fluxos, crio wireframes e protótipos, estruturo interfaces e acompanho a implementação junto a stakeholders e engenharia. Também utilizo IA generativa e ferramentas de código para acelerar exploração, documentação e construção de experiências.</w:t>
       </w:r>
     </w:p>
     <w:p>
@@ -375,41 +347,13 @@
                 <w:szCs w:val="22"/>
               </w:rPr>
             </w:pPr>
-            <w:proofErr w:type="spellStart"/>
             <w:r>
               <w:rPr>
                 <w:rFonts w:ascii="Manrope" w:hAnsi="Manrope"/>
                 <w:sz w:val="16"/>
                 <w:szCs w:val="16"/>
               </w:rPr>
-              <w:t>Product</w:t>
-            </w:r>
-            <w:proofErr w:type="spellEnd"/>
-            <w:r>
-              <w:rPr>
-                <w:rFonts w:ascii="Manrope" w:hAnsi="Manrope"/>
-                <w:sz w:val="16"/>
-                <w:szCs w:val="16"/>
-              </w:rPr>
-              <w:t xml:space="preserve"> Design • UX/UI • arquitetura da informação • jornadas e fluxos • </w:t>
-            </w:r>
-            <w:proofErr w:type="spellStart"/>
-            <w:r>
-              <w:rPr>
-                <w:rFonts w:ascii="Manrope" w:hAnsi="Manrope"/>
-                <w:sz w:val="16"/>
-                <w:szCs w:val="16"/>
-              </w:rPr>
-              <w:t>wireframes</w:t>
-            </w:r>
-            <w:proofErr w:type="spellEnd"/>
-            <w:r>
-              <w:rPr>
-                <w:rFonts w:ascii="Manrope" w:hAnsi="Manrope"/>
-                <w:sz w:val="16"/>
-                <w:szCs w:val="16"/>
-              </w:rPr>
-              <w:t xml:space="preserve"> • prototipação</w:t>
+              <w:t>Product Design • UX/UI • arquitetura da informação • jornadas e fluxos • wireframes • prototipação</w:t>
             </w:r>
           </w:p>
         </w:tc>
@@ -475,43 +419,7 @@
                 <w:sz w:val="16"/>
                 <w:szCs w:val="16"/>
               </w:rPr>
-              <w:t xml:space="preserve">Design responsivo • design systems • acessibilidade • UX </w:t>
-            </w:r>
-            <w:proofErr w:type="spellStart"/>
-            <w:r>
-              <w:rPr>
-                <w:rFonts w:ascii="Manrope" w:hAnsi="Manrope"/>
-                <w:sz w:val="16"/>
-                <w:szCs w:val="16"/>
-              </w:rPr>
-              <w:t>writing</w:t>
-            </w:r>
-            <w:proofErr w:type="spellEnd"/>
-            <w:r>
-              <w:rPr>
-                <w:rFonts w:ascii="Manrope" w:hAnsi="Manrope"/>
-                <w:sz w:val="16"/>
-                <w:szCs w:val="16"/>
-              </w:rPr>
-              <w:t xml:space="preserve"> • </w:t>
-            </w:r>
-            <w:proofErr w:type="spellStart"/>
-            <w:r>
-              <w:rPr>
-                <w:rFonts w:ascii="Manrope" w:hAnsi="Manrope"/>
-                <w:sz w:val="16"/>
-                <w:szCs w:val="16"/>
-              </w:rPr>
-              <w:t>handoff</w:t>
-            </w:r>
-            <w:proofErr w:type="spellEnd"/>
-            <w:r>
-              <w:rPr>
-                <w:rFonts w:ascii="Manrope" w:hAnsi="Manrope"/>
-                <w:sz w:val="16"/>
-                <w:szCs w:val="16"/>
-              </w:rPr>
-              <w:t xml:space="preserve"> para desenvolvimento</w:t>
+              <w:t>Design responsivo • design systems • acessibilidade • UX writing • handoff para desenvolvimento</w:t>
             </w:r>
           </w:p>
         </w:tc>
@@ -643,79 +551,7 @@
                 <w:sz w:val="16"/>
                 <w:szCs w:val="16"/>
               </w:rPr>
-              <w:t xml:space="preserve">HTML • CSS • </w:t>
-            </w:r>
-            <w:proofErr w:type="spellStart"/>
-            <w:r>
-              <w:rPr>
-                <w:rFonts w:ascii="Manrope" w:hAnsi="Manrope"/>
-                <w:sz w:val="16"/>
-                <w:szCs w:val="16"/>
-              </w:rPr>
-              <w:t>JavaScript</w:t>
-            </w:r>
-            <w:proofErr w:type="spellEnd"/>
-            <w:r>
-              <w:rPr>
-                <w:rFonts w:ascii="Manrope" w:hAnsi="Manrope"/>
-                <w:sz w:val="16"/>
-                <w:szCs w:val="16"/>
-              </w:rPr>
-              <w:t xml:space="preserve"> básico • </w:t>
-            </w:r>
-            <w:proofErr w:type="spellStart"/>
-            <w:r>
-              <w:rPr>
-                <w:rFonts w:ascii="Manrope" w:hAnsi="Manrope"/>
-                <w:sz w:val="16"/>
-                <w:szCs w:val="16"/>
-              </w:rPr>
-              <w:t>WordPress</w:t>
-            </w:r>
-            <w:proofErr w:type="spellEnd"/>
-            <w:r>
-              <w:rPr>
-                <w:rFonts w:ascii="Manrope" w:hAnsi="Manrope"/>
-                <w:sz w:val="16"/>
-                <w:szCs w:val="16"/>
-              </w:rPr>
-              <w:t xml:space="preserve"> • </w:t>
-            </w:r>
-            <w:proofErr w:type="spellStart"/>
-            <w:r>
-              <w:rPr>
-                <w:rFonts w:ascii="Manrope" w:hAnsi="Manrope"/>
-                <w:sz w:val="16"/>
-                <w:szCs w:val="16"/>
-              </w:rPr>
-              <w:t>Git</w:t>
-            </w:r>
-            <w:proofErr w:type="spellEnd"/>
-            <w:r>
-              <w:rPr>
-                <w:rFonts w:ascii="Manrope" w:hAnsi="Manrope"/>
-                <w:sz w:val="16"/>
-                <w:szCs w:val="16"/>
-              </w:rPr>
-              <w:t xml:space="preserve"> • Codex • Claude </w:t>
-            </w:r>
-            <w:proofErr w:type="spellStart"/>
-            <w:r>
-              <w:rPr>
-                <w:rFonts w:ascii="Manrope" w:hAnsi="Manrope"/>
-                <w:sz w:val="16"/>
-                <w:szCs w:val="16"/>
-              </w:rPr>
-              <w:t>Code</w:t>
-            </w:r>
-            <w:proofErr w:type="spellEnd"/>
-            <w:r>
-              <w:rPr>
-                <w:rFonts w:ascii="Manrope" w:hAnsi="Manrope"/>
-                <w:sz w:val="16"/>
-                <w:szCs w:val="16"/>
-              </w:rPr>
-              <w:t xml:space="preserve"> • IA generativa</w:t>
+              <w:t>HTML • CSS • JavaScript básico • WordPress • Git • Codex • Claude Code • IA generativa</w:t>
             </w:r>
           </w:p>
         </w:tc>
@@ -809,21 +645,8 @@
                 <w:sz w:val="18"/>
                 <w:szCs w:val="18"/>
               </w:rPr>
-              <w:t xml:space="preserve">| </w:t>
+              <w:t>| WebSupply</w:t>
             </w:r>
-            <w:proofErr w:type="spellStart"/>
-            <w:r>
-              <w:rPr>
-                <w:rFonts w:ascii="Manrope" w:hAnsi="Manrope"/>
-                <w:b/>
-                <w:bCs/>
-                <w:color w:val="4C94D8" w:themeColor="text2" w:themeTint="80"/>
-                <w:sz w:val="18"/>
-                <w:szCs w:val="18"/>
-              </w:rPr>
-              <w:t>WebSupply</w:t>
-            </w:r>
-            <w:proofErr w:type="spellEnd"/>
           </w:p>
         </w:tc>
         <w:tc>
@@ -854,21 +677,8 @@
                 <w:sz w:val="18"/>
                 <w:szCs w:val="18"/>
               </w:rPr>
-              <w:t xml:space="preserve">2022 - </w:t>
+              <w:t>2022 - atual</w:t>
             </w:r>
-            <w:proofErr w:type="gramStart"/>
-            <w:r>
-              <w:rPr>
-                <w:rFonts w:ascii="Manrope" w:hAnsi="Manrope"/>
-                <w:b/>
-                <w:bCs/>
-                <w:color w:val="747474" w:themeColor="background2" w:themeShade="80"/>
-                <w:sz w:val="18"/>
-                <w:szCs w:val="18"/>
-              </w:rPr>
-              <w:t>atual</w:t>
-            </w:r>
-            <w:proofErr w:type="gramEnd"/>
           </w:p>
         </w:tc>
       </w:tr>
@@ -890,27 +700,7 @@
           <w:sz w:val="16"/>
           <w:szCs w:val="16"/>
         </w:rPr>
-        <w:t xml:space="preserve">Produtos digitais B2B e </w:t>
-      </w:r>
-      <w:proofErr w:type="spellStart"/>
-      <w:r>
-        <w:rPr>
-          <w:rFonts w:ascii="Manrope" w:hAnsi="Manrope"/>
-          <w:color w:val="747474" w:themeColor="background2" w:themeShade="80"/>
-          <w:sz w:val="16"/>
-          <w:szCs w:val="16"/>
-        </w:rPr>
-        <w:t>enterprise</w:t>
-      </w:r>
-      <w:proofErr w:type="spellEnd"/>
-      <w:r>
-        <w:rPr>
-          <w:rFonts w:ascii="Manrope" w:hAnsi="Manrope"/>
-          <w:color w:val="747474" w:themeColor="background2" w:themeShade="80"/>
-          <w:sz w:val="16"/>
-          <w:szCs w:val="16"/>
-        </w:rPr>
-        <w:t xml:space="preserve"> para compras, fornecedores e operações corporativas.</w:t>
+        <w:t>Produtos digitais B2B e enterprise para compras, fornecedores e operações corporativas.</w:t>
       </w:r>
     </w:p>
     <w:p>
@@ -928,25 +718,7 @@
           <w:sz w:val="16"/>
           <w:szCs w:val="16"/>
         </w:rPr>
-        <w:t xml:space="preserve">Transformo requisitos de negócio e regras complexas em fluxos claros, </w:t>
-      </w:r>
-      <w:proofErr w:type="spellStart"/>
-      <w:r>
-        <w:rPr>
-          <w:rFonts w:ascii="Manrope" w:hAnsi="Manrope"/>
-          <w:sz w:val="16"/>
-          <w:szCs w:val="16"/>
-        </w:rPr>
-        <w:t>wireframes</w:t>
-      </w:r>
-      <w:proofErr w:type="spellEnd"/>
-      <w:r>
-        <w:rPr>
-          <w:rFonts w:ascii="Manrope" w:hAnsi="Manrope"/>
-          <w:sz w:val="16"/>
-          <w:szCs w:val="16"/>
-        </w:rPr>
-        <w:t>, interfaces responsivas e protótipos interativos.</w:t>
+        <w:t>Transformo requisitos de negócio e regras complexas em fluxos claros, wireframes, interfaces responsivas e protótipos interativos.</w:t>
       </w:r>
     </w:p>
     <w:p>
@@ -964,25 +736,7 @@
           <w:sz w:val="16"/>
           <w:szCs w:val="16"/>
         </w:rPr>
-        <w:t xml:space="preserve">Trabalho próximo a produto, stakeholders e engenharia, apoiando decisões, refinamentos, </w:t>
-      </w:r>
-      <w:proofErr w:type="spellStart"/>
-      <w:r>
-        <w:rPr>
-          <w:rFonts w:ascii="Manrope" w:hAnsi="Manrope"/>
-          <w:sz w:val="16"/>
-          <w:szCs w:val="16"/>
-        </w:rPr>
-        <w:t>handoff</w:t>
-      </w:r>
-      <w:proofErr w:type="spellEnd"/>
-      <w:r>
-        <w:rPr>
-          <w:rFonts w:ascii="Manrope" w:hAnsi="Manrope"/>
-          <w:sz w:val="16"/>
-          <w:szCs w:val="16"/>
-        </w:rPr>
-        <w:t xml:space="preserve"> e acompanhamento da implementação.</w:t>
+        <w:t>Trabalho próximo a produto, stakeholders e engenharia, apoiando decisões, refinamentos, handoff e acompanhamento da implementação.</w:t>
       </w:r>
     </w:p>
     <w:p>
@@ -1296,21 +1050,8 @@
                 <w:sz w:val="18"/>
                 <w:szCs w:val="18"/>
               </w:rPr>
-              <w:t xml:space="preserve">2012 - </w:t>
+              <w:t>2012 - atual</w:t>
             </w:r>
-            <w:proofErr w:type="gramStart"/>
-            <w:r>
-              <w:rPr>
-                <w:rFonts w:ascii="Manrope" w:hAnsi="Manrope"/>
-                <w:b/>
-                <w:bCs/>
-                <w:color w:val="747474" w:themeColor="background2" w:themeShade="80"/>
-                <w:sz w:val="18"/>
-                <w:szCs w:val="18"/>
-              </w:rPr>
-              <w:t>atual</w:t>
-            </w:r>
-            <w:proofErr w:type="gramEnd"/>
           </w:p>
         </w:tc>
       </w:tr>
@@ -1603,29 +1344,7 @@
           <w:sz w:val="16"/>
           <w:szCs w:val="16"/>
         </w:rPr>
-        <w:t xml:space="preserve">Pós-graduação em </w:t>
-      </w:r>
-      <w:proofErr w:type="spellStart"/>
-      <w:r>
-        <w:rPr>
-          <w:rFonts w:ascii="Manrope" w:hAnsi="Manrope"/>
-          <w:b/>
-          <w:bCs/>
-          <w:sz w:val="16"/>
-          <w:szCs w:val="16"/>
-        </w:rPr>
-        <w:t>User</w:t>
-      </w:r>
-      <w:proofErr w:type="spellEnd"/>
-      <w:r>
-        <w:rPr>
-          <w:rFonts w:ascii="Manrope" w:hAnsi="Manrope"/>
-          <w:b/>
-          <w:bCs/>
-          <w:sz w:val="16"/>
-          <w:szCs w:val="16"/>
-        </w:rPr>
-        <w:t xml:space="preserve"> Experience Design</w:t>
+        <w:t>Pós-graduação em User Experience Design</w:t>
       </w:r>
       <w:r>
         <w:rPr>
@@ -1753,45 +1472,8 @@
           <w:sz w:val="16"/>
           <w:szCs w:val="16"/>
         </w:rPr>
-        <w:t xml:space="preserve"> - </w:t>
-      </w:r>
-      <w:proofErr w:type="spellStart"/>
-      <w:r>
-        <w:rPr>
-          <w:rFonts w:ascii="Manrope" w:hAnsi="Manrope"/>
-          <w:sz w:val="16"/>
-          <w:szCs w:val="16"/>
-        </w:rPr>
-        <w:t>Mergo</w:t>
-      </w:r>
-      <w:proofErr w:type="spellEnd"/>
-      <w:r>
-        <w:rPr>
-          <w:rFonts w:ascii="Manrope" w:hAnsi="Manrope"/>
-          <w:sz w:val="16"/>
-          <w:szCs w:val="16"/>
-        </w:rPr>
-        <w:t xml:space="preserve"> </w:t>
-      </w:r>
-      <w:proofErr w:type="spellStart"/>
-      <w:r>
-        <w:rPr>
-          <w:rFonts w:ascii="Manrope" w:hAnsi="Manrope"/>
-          <w:sz w:val="16"/>
-          <w:szCs w:val="16"/>
-        </w:rPr>
-        <w:t>User</w:t>
-      </w:r>
-      <w:proofErr w:type="spellEnd"/>
-      <w:r>
-        <w:rPr>
-          <w:rFonts w:ascii="Manrope" w:hAnsi="Manrope"/>
-          <w:sz w:val="16"/>
-          <w:szCs w:val="16"/>
-        </w:rPr>
-        <w:t xml:space="preserve"> Experience   •   </w:t>
-      </w:r>
-      <w:proofErr w:type="spellStart"/>
+        <w:t xml:space="preserve"> - Mergo User Experience   •   </w:t>
+      </w:r>
       <w:r>
         <w:rPr>
           <w:rFonts w:ascii="Manrope" w:hAnsi="Manrope"/>
@@ -1800,18 +1482,7 @@
           <w:sz w:val="16"/>
           <w:szCs w:val="16"/>
         </w:rPr>
-        <w:t>JavaScript</w:t>
-      </w:r>
-      <w:proofErr w:type="spellEnd"/>
-      <w:r>
-        <w:rPr>
-          <w:rFonts w:ascii="Manrope" w:hAnsi="Manrope"/>
-          <w:b/>
-          <w:bCs/>
-          <w:sz w:val="16"/>
-          <w:szCs w:val="16"/>
-        </w:rPr>
-        <w:t xml:space="preserve"> </w:t>
+        <w:t xml:space="preserve">JavaScript </w:t>
       </w:r>
       <w:r>
         <w:rPr>
@@ -1947,41 +1618,13 @@
                 <w:szCs w:val="22"/>
               </w:rPr>
             </w:pPr>
-            <w:proofErr w:type="spellStart"/>
             <w:r>
               <w:rPr>
                 <w:rFonts w:ascii="Manrope" w:hAnsi="Manrope"/>
                 <w:sz w:val="16"/>
                 <w:szCs w:val="16"/>
               </w:rPr>
-              <w:t>Figma</w:t>
-            </w:r>
-            <w:proofErr w:type="spellEnd"/>
-            <w:r>
-              <w:rPr>
-                <w:rFonts w:ascii="Manrope" w:hAnsi="Manrope"/>
-                <w:sz w:val="16"/>
-                <w:szCs w:val="16"/>
-              </w:rPr>
-              <w:t xml:space="preserve"> • </w:t>
-            </w:r>
-            <w:proofErr w:type="spellStart"/>
-            <w:r>
-              <w:rPr>
-                <w:rFonts w:ascii="Manrope" w:hAnsi="Manrope"/>
-                <w:sz w:val="16"/>
-                <w:szCs w:val="16"/>
-              </w:rPr>
-              <w:t>FigJam</w:t>
-            </w:r>
-            <w:proofErr w:type="spellEnd"/>
-            <w:r>
-              <w:rPr>
-                <w:rFonts w:ascii="Manrope" w:hAnsi="Manrope"/>
-                <w:sz w:val="16"/>
-                <w:szCs w:val="16"/>
-              </w:rPr>
-              <w:t xml:space="preserve"> • Miro • Photoshop • Illustrator • Premiere Pro</w:t>
+              <w:t>Figma • FigJam • Miro • Photoshop • Illustrator • Premiere Pro</w:t>
             </w:r>
           </w:p>
         </w:tc>
@@ -2047,54 +1690,8 @@
                 <w:sz w:val="16"/>
                 <w:szCs w:val="16"/>
               </w:rPr>
-              <w:t xml:space="preserve">HTML • CSS • </w:t>
+              <w:t>HTML • CSS • JavaScript básico • WordPress • Git</w:t>
             </w:r>
-            <w:proofErr w:type="spellStart"/>
-            <w:r>
-              <w:rPr>
-                <w:rFonts w:ascii="Manrope" w:hAnsi="Manrope"/>
-                <w:sz w:val="16"/>
-                <w:szCs w:val="16"/>
-              </w:rPr>
-              <w:t>JavaScript</w:t>
-            </w:r>
-            <w:proofErr w:type="spellEnd"/>
-            <w:r>
-              <w:rPr>
-                <w:rFonts w:ascii="Manrope" w:hAnsi="Manrope"/>
-                <w:sz w:val="16"/>
-                <w:szCs w:val="16"/>
-              </w:rPr>
-              <w:t xml:space="preserve"> básico • </w:t>
-            </w:r>
-            <w:proofErr w:type="spellStart"/>
-            <w:r>
-              <w:rPr>
-                <w:rFonts w:ascii="Manrope" w:hAnsi="Manrope"/>
-                <w:sz w:val="16"/>
-                <w:szCs w:val="16"/>
-              </w:rPr>
-              <w:t>WordPress</w:t>
-            </w:r>
-            <w:proofErr w:type="spellEnd"/>
-            <w:r>
-              <w:rPr>
-                <w:rFonts w:ascii="Manrope" w:hAnsi="Manrope"/>
-                <w:sz w:val="16"/>
-                <w:szCs w:val="16"/>
-              </w:rPr>
-              <w:t xml:space="preserve"> • </w:t>
-            </w:r>
-            <w:proofErr w:type="spellStart"/>
-            <w:r>
-              <w:rPr>
-                <w:rFonts w:ascii="Manrope" w:hAnsi="Manrope"/>
-                <w:sz w:val="16"/>
-                <w:szCs w:val="16"/>
-              </w:rPr>
-              <w:t>Git</w:t>
-            </w:r>
-            <w:proofErr w:type="spellEnd"/>
           </w:p>
         </w:tc>
       </w:tr>
@@ -2159,25 +1756,7 @@
                 <w:sz w:val="16"/>
                 <w:szCs w:val="16"/>
               </w:rPr>
-              <w:t xml:space="preserve">Codex • Claude </w:t>
-            </w:r>
-            <w:proofErr w:type="spellStart"/>
-            <w:r>
-              <w:rPr>
-                <w:rFonts w:ascii="Manrope" w:hAnsi="Manrope"/>
-                <w:sz w:val="16"/>
-                <w:szCs w:val="16"/>
-              </w:rPr>
-              <w:t>Code</w:t>
-            </w:r>
-            <w:proofErr w:type="spellEnd"/>
-            <w:r>
-              <w:rPr>
-                <w:rFonts w:ascii="Manrope" w:hAnsi="Manrope"/>
-                <w:sz w:val="16"/>
-                <w:szCs w:val="16"/>
-              </w:rPr>
-              <w:t xml:space="preserve"> • ferramentas generativas de imagem, vídeo, voz e prototipação</w:t>
+              <w:t>Codex • Claude Code • ferramentas generativas de imagem, vídeo, voz e prototipação</w:t>
             </w:r>
           </w:p>
         </w:tc>

</xml_diff>